<commit_message>
doc: updated project proposal
</commit_message>
<xml_diff>
--- a/docs/proposal-docs/EMIT_Project-Proposal-Form_Updated.docx
+++ b/docs/proposal-docs/EMIT_Project-Proposal-Form_Updated.docx
@@ -65,12 +65,6 @@
         <w:gridCol w:w="2754"/>
       </w:tblGrid>
       <w:tr>
-        <w:tblPrEx>
-          <w:tblCellMar>
-            <w:top w:w="0" w:type="dxa"/>
-            <w:bottom w:w="0" w:type="dxa"/>
-          </w:tblCellMar>
-        </w:tblPrEx>
         <w:tc>
           <w:tcPr>
             <w:tcW w:w="2200" w:type="dxa"/>
@@ -116,10 +110,7 @@
               <w:spacing w:after="100"/>
             </w:pPr>
             <w:r>
-              <w:t xml:space="preserve"> </w:t>
-            </w:r>
-            <w:r>
-              <w:t>Md. Habibur Rahman</w:t>
+              <w:t xml:space="preserve"> Md. Habibur Rahman</w:t>
             </w:r>
           </w:p>
         </w:tc>
@@ -147,12 +138,6 @@
         </w:tc>
       </w:tr>
       <w:tr>
-        <w:tblPrEx>
-          <w:tblCellMar>
-            <w:top w:w="0" w:type="dxa"/>
-            <w:bottom w:w="0" w:type="dxa"/>
-          </w:tblCellMar>
-        </w:tblPrEx>
         <w:tc>
           <w:tcPr>
             <w:tcW w:w="2200" w:type="dxa"/>
@@ -173,21 +158,12 @@
             <w:pPr>
               <w:spacing w:after="100"/>
             </w:pPr>
-            <w:proofErr w:type="gramStart"/>
             <w:r>
               <w:rPr>
                 <w:b/>
                 <w:bCs/>
               </w:rPr>
-              <w:t>Student's</w:t>
-            </w:r>
-            <w:proofErr w:type="gramEnd"/>
-            <w:r>
-              <w:rPr>
-                <w:b/>
-                <w:bCs/>
-              </w:rPr>
-              <w:t xml:space="preserve"> Roll:</w:t>
+              <w:t>Student's Roll:</w:t>
             </w:r>
           </w:p>
         </w:tc>
@@ -279,12 +255,6 @@
         </w:tc>
       </w:tr>
       <w:tr>
-        <w:tblPrEx>
-          <w:tblCellMar>
-            <w:top w:w="0" w:type="dxa"/>
-            <w:bottom w:w="0" w:type="dxa"/>
-          </w:tblCellMar>
-        </w:tblPrEx>
         <w:tc>
           <w:tcPr>
             <w:tcW w:w="9372" w:type="dxa"/>
@@ -351,15 +321,7 @@
               <w:spacing w:after="100"/>
             </w:pPr>
             <w:r>
-              <w:t xml:space="preserve">The Govt. </w:t>
-            </w:r>
-            <w:proofErr w:type="spellStart"/>
-            <w:r>
-              <w:t>Haraganga</w:t>
-            </w:r>
-            <w:proofErr w:type="spellEnd"/>
-            <w:r>
-              <w:t xml:space="preserve"> College Alumni Association needs a low-cost, maintainable and privacy-aware system of record that volunteers can operate. The platform must work without enterprise-level staffing, recurring software </w:t>
+              <w:t xml:space="preserve">The Govt. Haraganga College Alumni Association needs a low-cost, maintainable and privacy-aware system of record that volunteers can operate. The platform must work without enterprise-level staffing, recurring software </w:t>
             </w:r>
             <w:r>
               <w:t>licenses</w:t>
@@ -453,200 +415,69 @@
               <w:spacing w:after="100"/>
             </w:pPr>
             <w:r>
-              <w:t xml:space="preserve">The project was positioned against institutional advancement platforms, </w:t>
-            </w:r>
-            <w:proofErr w:type="spellStart"/>
-            <w:r>
-              <w:t>CiviCRM</w:t>
-            </w:r>
-            <w:proofErr w:type="spellEnd"/>
-            <w:r>
-              <w:t xml:space="preserve"> and other open-source membership systems, general-purpose CRM products such as Salesforce Nonprofit Success Pack, Zoho CRM and HubSpot, and community products such as Discourse. Those products are stronger in some mature functions, especially campaigns, reporting, directories, events and mentoring. The identified gap is their combination of:</w:t>
-            </w:r>
-          </w:p>
-          <w:p>
-            <w:pPr>
-              <w:pStyle w:val="ListParagraph"/>
-              <w:numPr>
-                <w:ilvl w:val="0"/>
-                <w:numId w:val="5"/>
-              </w:numPr>
+              <w:t>The project was positioned against institutional advancement platforms, CiviCRM and other open-source membership systems, general-purpose CRM products such as Salesforce Nonprofit Success Pack, Zoho CRM and HubSpot, and community products such as Discourse. Those products are stronger in some mature functions, especially campaigns, reporting, directories, events and mentoring. The identified gap is their combination of:</w:t>
+            </w:r>
+          </w:p>
+          <w:p>
+            <w:pPr>
               <w:spacing w:after="60"/>
-            </w:pPr>
-            <w:r>
-              <w:t>Real-time: ASP.NET Core SignalR</w:t>
-            </w:r>
-          </w:p>
-          <w:p>
-            <w:pPr>
-              <w:pStyle w:val="ListParagraph"/>
-              <w:numPr>
-                <w:ilvl w:val="0"/>
-                <w:numId w:val="5"/>
-              </w:numPr>
+              <w:ind w:left="160"/>
+            </w:pPr>
+            <w:r>
+              <w:t>- constitutional governance, auditable rules;</w:t>
+            </w:r>
+          </w:p>
+          <w:p>
+            <w:pPr>
               <w:spacing w:after="60"/>
-            </w:pPr>
-            <w:r>
-              <w:t xml:space="preserve">Authentication: JWT, </w:t>
-            </w:r>
-            <w:proofErr w:type="spellStart"/>
-            <w:r>
-              <w:t>BCrypt</w:t>
-            </w:r>
-            <w:proofErr w:type="spellEnd"/>
-            <w:r>
-              <w:t xml:space="preserve"> and role-based authorization</w:t>
-            </w:r>
-          </w:p>
-          <w:p>
-            <w:pPr>
-              <w:pStyle w:val="ListParagraph"/>
-              <w:numPr>
-                <w:ilvl w:val="0"/>
-                <w:numId w:val="5"/>
-              </w:numPr>
+              <w:ind w:left="160"/>
+            </w:pPr>
+            <w:r>
+              <w:t>- manual payment with proof upload and officer verification as the primary path;</w:t>
+            </w:r>
+          </w:p>
+          <w:p>
+            <w:pPr>
               <w:spacing w:after="60"/>
-            </w:pPr>
-            <w:r>
-              <w:t xml:space="preserve">Testing: </w:t>
-            </w:r>
-            <w:proofErr w:type="spellStart"/>
-            <w:r>
-              <w:t>NUnit</w:t>
-            </w:r>
-            <w:proofErr w:type="spellEnd"/>
-            <w:r>
-              <w:t xml:space="preserve">, </w:t>
-            </w:r>
-            <w:proofErr w:type="spellStart"/>
-            <w:r>
-              <w:t>Moq</w:t>
-            </w:r>
-            <w:proofErr w:type="spellEnd"/>
-            <w:r>
-              <w:t xml:space="preserve">, </w:t>
-            </w:r>
-            <w:proofErr w:type="spellStart"/>
-            <w:r>
-              <w:t>FluentAssertions</w:t>
-            </w:r>
-            <w:proofErr w:type="spellEnd"/>
-            <w:r>
-              <w:t xml:space="preserve">, </w:t>
-            </w:r>
-            <w:proofErr w:type="spellStart"/>
-            <w:r>
-              <w:t>Vitest</w:t>
-            </w:r>
-            <w:proofErr w:type="spellEnd"/>
-            <w:r>
-              <w:t>, Playwright, Flutter Test and integration tests</w:t>
-            </w:r>
-          </w:p>
-          <w:p>
-            <w:pPr>
-              <w:pStyle w:val="ListParagraph"/>
-              <w:numPr>
-                <w:ilvl w:val="0"/>
-                <w:numId w:val="5"/>
-              </w:numPr>
+              <w:ind w:left="160"/>
+            </w:pPr>
+            <w:r>
+              <w:t>- Bengali/local identity and financial-channel support;</w:t>
+            </w:r>
+          </w:p>
+          <w:p>
+            <w:pPr>
               <w:spacing w:after="60"/>
-            </w:pPr>
-            <w:r>
-              <w:t>Coverage: Coverlet and .NET test tooling</w:t>
-            </w:r>
-          </w:p>
-          <w:p>
-            <w:pPr>
-              <w:pStyle w:val="ListParagraph"/>
-              <w:numPr>
-                <w:ilvl w:val="0"/>
-                <w:numId w:val="5"/>
-              </w:numPr>
+              <w:ind w:left="160"/>
+            </w:pPr>
+            <w:r>
+              <w:t>- data sovereignty and clean exit;</w:t>
+            </w:r>
+          </w:p>
+          <w:p>
+            <w:pPr>
               <w:spacing w:after="60"/>
-            </w:pPr>
-            <w:r>
-              <w:t>Quality checks: .NET formatting, TypeScript type checking, Dart analysis and CI validation</w:t>
-            </w:r>
-          </w:p>
-          <w:p>
-            <w:pPr>
-              <w:pStyle w:val="ListParagraph"/>
-              <w:numPr>
-                <w:ilvl w:val="0"/>
-                <w:numId w:val="5"/>
-              </w:numPr>
+              <w:ind w:left="160"/>
+            </w:pPr>
+            <w:r>
+              <w:t>- mobile fitness;</w:t>
+            </w:r>
+          </w:p>
+          <w:p>
+            <w:pPr>
               <w:spacing w:after="60"/>
-            </w:pPr>
-            <w:r>
-              <w:t>Version control: Git and GitHub</w:t>
-            </w:r>
-          </w:p>
-          <w:p>
-            <w:pPr>
-              <w:pStyle w:val="ListParagraph"/>
-              <w:numPr>
-                <w:ilvl w:val="0"/>
-                <w:numId w:val="5"/>
-              </w:numPr>
+              <w:ind w:left="160"/>
+            </w:pPr>
+            <w:r>
+              <w:t>- operation at a low annual cost.</w:t>
+            </w:r>
+          </w:p>
+          <w:p>
+            <w:pPr>
               <w:spacing w:after="60"/>
             </w:pPr>
             <w:r>
-              <w:t>CI/CD: GitHub Actions</w:t>
-            </w:r>
-          </w:p>
-          <w:p>
-            <w:pPr>
-              <w:pStyle w:val="ListParagraph"/>
-              <w:numPr>
-                <w:ilvl w:val="0"/>
-                <w:numId w:val="5"/>
-              </w:numPr>
-              <w:spacing w:after="60"/>
-            </w:pPr>
-            <w:r>
               <w:lastRenderedPageBreak/>
-              <w:t>Packaging and deployment: Docker and hosted pre-production deployment</w:t>
-            </w:r>
-          </w:p>
-          <w:p>
-            <w:pPr>
-              <w:pStyle w:val="ListParagraph"/>
-              <w:numPr>
-                <w:ilvl w:val="0"/>
-                <w:numId w:val="5"/>
-              </w:numPr>
-              <w:spacing w:after="60"/>
-              <w:rPr>
-                <w:lang w:val="it-IT"/>
-              </w:rPr>
-            </w:pPr>
-            <w:r>
-              <w:rPr>
-                <w:lang w:val="it-IT"/>
-              </w:rPr>
-              <w:t xml:space="preserve">IDE/Editor: Visual Studio Code, MS Visual Studio, </w:t>
-            </w:r>
-            <w:proofErr w:type="spellStart"/>
-            <w:r>
-              <w:rPr>
-                <w:lang w:val="it-IT"/>
-              </w:rPr>
-              <w:t>Antigravi</w:t>
-            </w:r>
-            <w:r>
-              <w:rPr>
-                <w:lang w:val="it-IT"/>
-              </w:rPr>
-              <w:t>ty</w:t>
-            </w:r>
-            <w:proofErr w:type="spellEnd"/>
-          </w:p>
-          <w:p>
-            <w:pPr>
-              <w:spacing w:after="100"/>
-            </w:pPr>
-            <w:r>
               <w:t>The contribution is the combination and the documented trade-offs, not a claim that every individual feature is novel.</w:t>
             </w:r>
           </w:p>
@@ -795,33 +626,15 @@
               <w:spacing w:after="100"/>
             </w:pPr>
             <w:r>
-              <w:t xml:space="preserve">The persistence boundary is provider-neutral to the extent required by the specification: PostgreSQL is the deployment </w:t>
-            </w:r>
-            <w:r>
-              <w:t>provider,</w:t>
-            </w:r>
-            <w:r>
-              <w:t xml:space="preserve"> and SQLite is used for local development and tests without changing business source code. The deployment is also container-portable and is intended to run on a container host without a proprietary platform dependency.</w:t>
-            </w:r>
-          </w:p>
-          <w:p>
-            <w:pPr>
-              <w:spacing w:after="100"/>
-            </w:pPr>
-            <w:r>
-              <w:t xml:space="preserve">Legacy handling is part of the design rather than an afterthought. Migration bootstrap detects databases created by the earlier schema mechanism, baselines existing objects when appropriate, </w:t>
-            </w:r>
-            <w:r>
-              <w:t>apply</w:t>
-            </w:r>
-            <w:r>
-              <w:t xml:space="preserve"> only genuinely pending migrations, and logs failures. Membership and financial records use archival deletion and query </w:t>
-            </w:r>
-            <w:r>
-              <w:t>filters,</w:t>
-            </w:r>
-            <w:r>
-              <w:t xml:space="preserve"> so ordinary screens hide archived rows without destroying audit evidence. Full export in an open format is a portability requirement.</w:t>
+              <w:t>The persistence boundary is provider-neutral to the extent required by the specification: PostgreSQL is the deployment provider, and SQLite is used for local development and tests without changing business source code. The deployment is also container-portable and is intended to run on a container host without a proprietary platform dependency.</w:t>
+            </w:r>
+          </w:p>
+          <w:p>
+            <w:pPr>
+              <w:spacing w:after="100"/>
+            </w:pPr>
+            <w:r>
+              <w:t>Legacy handling is part of the design rather than an afterthought. Migration bootstrap detects databases created by the earlier schema mechanism, baselines existing objects when appropriate, apply only genuinely pending migrations, and logs failures. Membership and financial records use archival deletion and query filters, so ordinary screens hide archived rows without destroying audit evidence. Full export in an open format is a portability requirement.</w:t>
             </w:r>
           </w:p>
           <w:p>
@@ -848,19 +661,7 @@
               <w:t>Runtime configuration:</w:t>
             </w:r>
             <w:r>
-              <w:t> </w:t>
-            </w:r>
-            <w:r>
-              <w:t>organization</w:t>
-            </w:r>
-            <w:r>
-              <w:t xml:space="preserve"> name, branding, contact details, currency, feature flags, workflow settings, membership presentation, payment instructions and public content can be changed by </w:t>
-            </w:r>
-            <w:r>
-              <w:t>authorized</w:t>
-            </w:r>
-            <w:r>
-              <w:t xml:space="preserve"> administrators without redeployment.</w:t>
+              <w:t> organization name, branding, contact details, currency, feature flags, workflow settings, membership presentation, payment instructions and public content can be changed by authorized administrators without redeployment.</w:t>
             </w:r>
           </w:p>
           <w:p>
@@ -887,13 +688,7 @@
               <w:spacing w:after="100"/>
             </w:pPr>
             <w:r>
-              <w:t xml:space="preserve">The profile-pack goal is deployment of a new </w:t>
-            </w:r>
-            <w:r>
-              <w:t>organization</w:t>
-            </w:r>
-            <w:r>
-              <w:t xml:space="preserve"> from configuration and assets rather than a source fork. The current prototype already provides substantial runtime and profile support, while the remaining brand-literal cleanup and full zero-source-change onboarding remain explicit implementation work. This distinction prevents a planned white-label capability from being presented as fully proven.</w:t>
+              <w:t>The profile-pack goal is deployment of a new organization from configuration and assets rather than a source fork. The current prototype already provides substantial runtime and profile support, while the remaining brand-literal cleanup and full zero-source-change onboarding remain explicit implementation work. This distinction prevents a planned white-label capability from being presented as fully proven.</w:t>
             </w:r>
           </w:p>
           <w:p>
@@ -988,7 +783,11 @@
               <w:t>Non-functional requirements</w:t>
             </w:r>
             <w:r>
-              <w:t xml:space="preserve"> cover performance, security, reliability, usability, maintainability, portability, recovery, auditability and privacy, evaluated through quality-attribute scenarios such as directory latency, session invalidation on status change, dependency-failure isolation, architecture-rule enforcement and recovery time. The prototype already includes the backend, web app, mobile app, authentication, accounting, membership, events, governance and CI/CD. Remaining work covers traceability closure, measured coverage, security and usability evidence, performance evaluation and documentation.</w:t>
+              <w:t xml:space="preserve"> cover performance, security, reliability, usability, maintainability, portability, recovery, auditability and privacy, evaluated through quality-attribute scenarios such as directory latency, session </w:t>
+            </w:r>
+            <w:r>
+              <w:lastRenderedPageBreak/>
+              <w:t>invalidation on status change, dependency-failure isolation, architecture-rule enforcement and recovery time. The prototype already includes the backend, web app, mobile app, authentication, accounting, membership, events, governance and CI/CD. Remaining work covers traceability closure, measured coverage, security and usability evidence, performance evaluation and documentation.</w:t>
             </w:r>
           </w:p>
           <w:p>
@@ -1040,12 +839,6 @@
               <w:gridCol w:w="1467"/>
             </w:tblGrid>
             <w:tr>
-              <w:tblPrEx>
-                <w:tblCellMar>
-                  <w:top w:w="0" w:type="dxa"/>
-                  <w:bottom w:w="0" w:type="dxa"/>
-                </w:tblCellMar>
-              </w:tblPrEx>
               <w:tc>
                 <w:tcPr>
                   <w:tcW w:w="789" w:type="dxa"/>
@@ -1164,12 +957,6 @@
               </w:tc>
             </w:tr>
             <w:tr>
-              <w:tblPrEx>
-                <w:tblCellMar>
-                  <w:top w:w="0" w:type="dxa"/>
-                  <w:bottom w:w="0" w:type="dxa"/>
-                </w:tblCellMar>
-              </w:tblPrEx>
               <w:tc>
                 <w:tcPr>
                   <w:tcW w:w="789" w:type="dxa"/>
@@ -1293,12 +1080,6 @@
               </w:tc>
             </w:tr>
             <w:tr>
-              <w:tblPrEx>
-                <w:tblCellMar>
-                  <w:top w:w="0" w:type="dxa"/>
-                  <w:bottom w:w="0" w:type="dxa"/>
-                </w:tblCellMar>
-              </w:tblPrEx>
               <w:tc>
                 <w:tcPr>
                   <w:tcW w:w="789" w:type="dxa"/>
@@ -1413,12 +1194,6 @@
               </w:tc>
             </w:tr>
             <w:tr>
-              <w:tblPrEx>
-                <w:tblCellMar>
-                  <w:top w:w="0" w:type="dxa"/>
-                  <w:bottom w:w="0" w:type="dxa"/>
-                </w:tblCellMar>
-              </w:tblPrEx>
               <w:tc>
                 <w:tcPr>
                   <w:tcW w:w="789" w:type="dxa"/>
@@ -1521,12 +1296,6 @@
               </w:tc>
             </w:tr>
             <w:tr>
-              <w:tblPrEx>
-                <w:tblCellMar>
-                  <w:top w:w="0" w:type="dxa"/>
-                  <w:bottom w:w="0" w:type="dxa"/>
-                </w:tblCellMar>
-              </w:tblPrEx>
               <w:tc>
                 <w:tcPr>
                   <w:tcW w:w="789" w:type="dxa"/>
@@ -1607,13 +1376,7 @@
                     <w:t>requirements</w:t>
                   </w:r>
                   <w:r>
-                    <w:t xml:space="preserve"> </w:t>
-                  </w:r>
-                  <w:r>
-                    <w:t xml:space="preserve">-&gt; </w:t>
-                  </w:r>
-                  <w:r>
-                    <w:t>use cases</w:t>
+                    <w:t xml:space="preserve"> -&gt; use cases</w:t>
                   </w:r>
                   <w:r>
                     <w:t xml:space="preserve"> -&gt; business rule -&gt; component -&gt; test) drafted for core modules.</w:t>
@@ -1647,12 +1410,6 @@
               </w:tc>
             </w:tr>
             <w:tr>
-              <w:tblPrEx>
-                <w:tblCellMar>
-                  <w:top w:w="0" w:type="dxa"/>
-                  <w:bottom w:w="0" w:type="dxa"/>
-                </w:tblCellMar>
-              </w:tblPrEx>
               <w:tc>
                 <w:tcPr>
                   <w:tcW w:w="789" w:type="dxa"/>
@@ -1755,12 +1512,6 @@
               </w:tc>
             </w:tr>
             <w:tr>
-              <w:tblPrEx>
-                <w:tblCellMar>
-                  <w:top w:w="0" w:type="dxa"/>
-                  <w:bottom w:w="0" w:type="dxa"/>
-                </w:tblCellMar>
-              </w:tblPrEx>
               <w:tc>
                 <w:tcPr>
                   <w:tcW w:w="789" w:type="dxa"/>
@@ -1863,12 +1614,6 @@
               </w:tc>
             </w:tr>
             <w:tr>
-              <w:tblPrEx>
-                <w:tblCellMar>
-                  <w:top w:w="0" w:type="dxa"/>
-                  <w:bottom w:w="0" w:type="dxa"/>
-                </w:tblCellMar>
-              </w:tblPrEx>
               <w:tc>
                 <w:tcPr>
                   <w:tcW w:w="789" w:type="dxa"/>
@@ -1971,12 +1716,6 @@
               </w:tc>
             </w:tr>
             <w:tr>
-              <w:tblPrEx>
-                <w:tblCellMar>
-                  <w:top w:w="0" w:type="dxa"/>
-                  <w:bottom w:w="0" w:type="dxa"/>
-                </w:tblCellMar>
-              </w:tblPrEx>
               <w:tc>
                 <w:tcPr>
                   <w:tcW w:w="789" w:type="dxa"/>
@@ -2079,12 +1818,6 @@
               </w:tc>
             </w:tr>
             <w:tr>
-              <w:tblPrEx>
-                <w:tblCellMar>
-                  <w:top w:w="0" w:type="dxa"/>
-                  <w:bottom w:w="0" w:type="dxa"/>
-                </w:tblCellMar>
-              </w:tblPrEx>
               <w:tc>
                 <w:tcPr>
                   <w:tcW w:w="789" w:type="dxa"/>
@@ -2187,12 +1920,6 @@
               </w:tc>
             </w:tr>
             <w:tr>
-              <w:tblPrEx>
-                <w:tblCellMar>
-                  <w:top w:w="0" w:type="dxa"/>
-                  <w:bottom w:w="0" w:type="dxa"/>
-                </w:tblCellMar>
-              </w:tblPrEx>
               <w:tc>
                 <w:tcPr>
                   <w:tcW w:w="789" w:type="dxa"/>
@@ -2295,12 +2022,6 @@
               </w:tc>
             </w:tr>
             <w:tr>
-              <w:tblPrEx>
-                <w:tblCellMar>
-                  <w:top w:w="0" w:type="dxa"/>
-                  <w:bottom w:w="0" w:type="dxa"/>
-                </w:tblCellMar>
-              </w:tblPrEx>
               <w:tc>
                 <w:tcPr>
                   <w:tcW w:w="789" w:type="dxa"/>
@@ -2403,12 +2124,6 @@
               </w:tc>
             </w:tr>
             <w:tr>
-              <w:tblPrEx>
-                <w:tblCellMar>
-                  <w:top w:w="0" w:type="dxa"/>
-                  <w:bottom w:w="0" w:type="dxa"/>
-                </w:tblCellMar>
-              </w:tblPrEx>
               <w:tc>
                 <w:tcPr>
                   <w:tcW w:w="789" w:type="dxa"/>
@@ -2430,7 +2145,6 @@
                     <w:spacing w:after="100"/>
                   </w:pPr>
                   <w:r>
-                    <w:lastRenderedPageBreak/>
                     <w:t>12</w:t>
                   </w:r>
                 </w:p>
@@ -2512,12 +2226,6 @@
               </w:tc>
             </w:tr>
             <w:tr>
-              <w:tblPrEx>
-                <w:tblCellMar>
-                  <w:top w:w="0" w:type="dxa"/>
-                  <w:bottom w:w="0" w:type="dxa"/>
-                </w:tblCellMar>
-              </w:tblPrEx>
               <w:tc>
                 <w:tcPr>
                   <w:tcW w:w="789" w:type="dxa"/>
@@ -2539,6 +2247,7 @@
                     <w:spacing w:after="100"/>
                   </w:pPr>
                   <w:r>
+                    <w:lastRenderedPageBreak/>
                     <w:t>13</w:t>
                   </w:r>
                 </w:p>
@@ -2620,12 +2329,6 @@
               </w:tc>
             </w:tr>
             <w:tr>
-              <w:tblPrEx>
-                <w:tblCellMar>
-                  <w:top w:w="0" w:type="dxa"/>
-                  <w:bottom w:w="0" w:type="dxa"/>
-                </w:tblCellMar>
-              </w:tblPrEx>
               <w:tc>
                 <w:tcPr>
                   <w:tcW w:w="789" w:type="dxa"/>
@@ -2728,12 +2431,6 @@
               </w:tc>
             </w:tr>
             <w:tr>
-              <w:tblPrEx>
-                <w:tblCellMar>
-                  <w:top w:w="0" w:type="dxa"/>
-                  <w:bottom w:w="0" w:type="dxa"/>
-                </w:tblCellMar>
-              </w:tblPrEx>
               <w:tc>
                 <w:tcPr>
                   <w:tcW w:w="789" w:type="dxa"/>
@@ -2836,12 +2533,6 @@
               </w:tc>
             </w:tr>
             <w:tr>
-              <w:tblPrEx>
-                <w:tblCellMar>
-                  <w:top w:w="0" w:type="dxa"/>
-                  <w:bottom w:w="0" w:type="dxa"/>
-                </w:tblCellMar>
-              </w:tblPrEx>
               <w:tc>
                 <w:tcPr>
                   <w:tcW w:w="789" w:type="dxa"/>
@@ -2944,12 +2635,6 @@
               </w:tc>
             </w:tr>
             <w:tr>
-              <w:tblPrEx>
-                <w:tblCellMar>
-                  <w:top w:w="0" w:type="dxa"/>
-                  <w:bottom w:w="0" w:type="dxa"/>
-                </w:tblCellMar>
-              </w:tblPrEx>
               <w:tc>
                 <w:tcPr>
                   <w:tcW w:w="789" w:type="dxa"/>
@@ -3052,12 +2737,6 @@
               </w:tc>
             </w:tr>
             <w:tr>
-              <w:tblPrEx>
-                <w:tblCellMar>
-                  <w:top w:w="0" w:type="dxa"/>
-                  <w:bottom w:w="0" w:type="dxa"/>
-                </w:tblCellMar>
-              </w:tblPrEx>
               <w:tc>
                 <w:tcPr>
                   <w:tcW w:w="789" w:type="dxa"/>
@@ -3160,12 +2839,6 @@
               </w:tc>
             </w:tr>
             <w:tr>
-              <w:tblPrEx>
-                <w:tblCellMar>
-                  <w:top w:w="0" w:type="dxa"/>
-                  <w:bottom w:w="0" w:type="dxa"/>
-                </w:tblCellMar>
-              </w:tblPrEx>
               <w:tc>
                 <w:tcPr>
                   <w:tcW w:w="789" w:type="dxa"/>
@@ -3268,12 +2941,6 @@
               </w:tc>
             </w:tr>
             <w:tr>
-              <w:tblPrEx>
-                <w:tblCellMar>
-                  <w:top w:w="0" w:type="dxa"/>
-                  <w:bottom w:w="0" w:type="dxa"/>
-                </w:tblCellMar>
-              </w:tblPrEx>
               <w:tc>
                 <w:tcPr>
                   <w:tcW w:w="789" w:type="dxa"/>
@@ -3376,12 +3043,6 @@
               </w:tc>
             </w:tr>
             <w:tr>
-              <w:tblPrEx>
-                <w:tblCellMar>
-                  <w:top w:w="0" w:type="dxa"/>
-                  <w:bottom w:w="0" w:type="dxa"/>
-                </w:tblCellMar>
-              </w:tblPrEx>
               <w:tc>
                 <w:tcPr>
                   <w:tcW w:w="789" w:type="dxa"/>
@@ -3484,12 +3145,6 @@
               </w:tc>
             </w:tr>
             <w:tr>
-              <w:tblPrEx>
-                <w:tblCellMar>
-                  <w:top w:w="0" w:type="dxa"/>
-                  <w:bottom w:w="0" w:type="dxa"/>
-                </w:tblCellMar>
-              </w:tblPrEx>
               <w:tc>
                 <w:tcPr>
                   <w:tcW w:w="789" w:type="dxa"/>
@@ -3592,12 +3247,6 @@
               </w:tc>
             </w:tr>
             <w:tr>
-              <w:tblPrEx>
-                <w:tblCellMar>
-                  <w:top w:w="0" w:type="dxa"/>
-                  <w:bottom w:w="0" w:type="dxa"/>
-                </w:tblCellMar>
-              </w:tblPrEx>
               <w:tc>
                 <w:tcPr>
                   <w:tcW w:w="789" w:type="dxa"/>
@@ -3700,12 +3349,6 @@
               </w:tc>
             </w:tr>
             <w:tr>
-              <w:tblPrEx>
-                <w:tblCellMar>
-                  <w:top w:w="0" w:type="dxa"/>
-                  <w:bottom w:w="0" w:type="dxa"/>
-                </w:tblCellMar>
-              </w:tblPrEx>
               <w:tc>
                 <w:tcPr>
                   <w:tcW w:w="789" w:type="dxa"/>
@@ -3808,12 +3451,6 @@
               </w:tc>
             </w:tr>
             <w:tr>
-              <w:tblPrEx>
-                <w:tblCellMar>
-                  <w:top w:w="0" w:type="dxa"/>
-                  <w:bottom w:w="0" w:type="dxa"/>
-                </w:tblCellMar>
-              </w:tblPrEx>
               <w:tc>
                 <w:tcPr>
                   <w:tcW w:w="789" w:type="dxa"/>
@@ -3916,12 +3553,6 @@
               </w:tc>
             </w:tr>
             <w:tr>
-              <w:tblPrEx>
-                <w:tblCellMar>
-                  <w:top w:w="0" w:type="dxa"/>
-                  <w:bottom w:w="0" w:type="dxa"/>
-                </w:tblCellMar>
-              </w:tblPrEx>
               <w:tc>
                 <w:tcPr>
                   <w:tcW w:w="789" w:type="dxa"/>
@@ -4024,12 +3655,6 @@
               </w:tc>
             </w:tr>
             <w:tr>
-              <w:tblPrEx>
-                <w:tblCellMar>
-                  <w:top w:w="0" w:type="dxa"/>
-                  <w:bottom w:w="0" w:type="dxa"/>
-                </w:tblCellMar>
-              </w:tblPrEx>
               <w:tc>
                 <w:tcPr>
                   <w:tcW w:w="789" w:type="dxa"/>
@@ -4076,20 +3701,7 @@
                     <w:spacing w:after="100"/>
                   </w:pPr>
                   <w:r>
-                    <w:t xml:space="preserve">AI-Agent Feasibility </w:t>
-                  </w:r>
-                  <w:r>
-                    <w:lastRenderedPageBreak/>
-                    <w:t>Extension</w:t>
-                  </w:r>
-                  <w:r>
-                    <w:t xml:space="preserve"> (</w:t>
-                  </w:r>
-                  <w:r>
-                    <w:t>Optional</w:t>
-                  </w:r>
-                  <w:r>
-                    <w:t>)</w:t>
+                    <w:t>AI-Agent Feasibility Extension (Optional)</w:t>
                   </w:r>
                 </w:p>
               </w:tc>
@@ -4114,12 +3726,7 @@
                     <w:spacing w:after="100"/>
                   </w:pPr>
                   <w:r>
-                    <w:lastRenderedPageBreak/>
-                    <w:t xml:space="preserve">Add a controlled, advisory AI agent for policy lookup, portal navigation and approved information retrieval. The agent will use existing authentication, authorization </w:t>
-                  </w:r>
-                  <w:r>
-                    <w:lastRenderedPageBreak/>
-                    <w:t>and privacy controls and will not approve membership, verify payments, modify accounting records or determine election eligibility.</w:t>
+                    <w:t>Add a controlled, advisory AI agent for policy lookup, portal navigation and approved information retrieval. The agent will use existing authentication, authorization and privacy controls and will not approve membership, verify payments, modify accounting records or determine election eligibility.</w:t>
                   </w:r>
                 </w:p>
               </w:tc>
@@ -4144,7 +3751,6 @@
                     <w:spacing w:after="100"/>
                   </w:pPr>
                   <w:r>
-                    <w:lastRenderedPageBreak/>
                     <w:t>1-20</w:t>
                   </w:r>
                 </w:p>
@@ -4159,6 +3765,7 @@
               <w:rPr>
                 <w:noProof/>
               </w:rPr>
+              <w:lastRenderedPageBreak/>
               <w:drawing>
                 <wp:inline distT="0" distB="0" distL="0" distR="0" wp14:anchorId="126B34B1" wp14:editId="35D132C2">
                   <wp:extent cx="5760720" cy="2693976"/>
@@ -4204,12 +3811,6 @@
         </w:tc>
       </w:tr>
       <w:tr>
-        <w:tblPrEx>
-          <w:tblCellMar>
-            <w:top w:w="0" w:type="dxa"/>
-            <w:bottom w:w="0" w:type="dxa"/>
-          </w:tblCellMar>
-        </w:tblPrEx>
         <w:tc>
           <w:tcPr>
             <w:tcW w:w="9372" w:type="dxa"/>
@@ -4346,23 +3947,7 @@
                 <w:b/>
                 <w:bCs/>
               </w:rPr>
-              <w:t xml:space="preserve">AI Tools / Assistants (if </w:t>
-            </w:r>
-            <w:proofErr w:type="gramStart"/>
-            <w:r>
-              <w:rPr>
-                <w:b/>
-                <w:bCs/>
-              </w:rPr>
-              <w:t>any) —</w:t>
-            </w:r>
-            <w:proofErr w:type="gramEnd"/>
-            <w:r>
-              <w:rPr>
-                <w:b/>
-                <w:bCs/>
-              </w:rPr>
-              <w:t xml:space="preserve"> e.g., GitHub Copilot, ChatGPT, Claude</w:t>
+              <w:t>AI Tools / Assistants (if any) — e.g., GitHub Copilot, ChatGPT, Claude</w:t>
             </w:r>
             <w:r>
               <w:t>: GitHub Copilot (via Copilot SDK in VS Code), Claude</w:t>
@@ -4425,15 +4010,7 @@
               <w:t>Authentication</w:t>
             </w:r>
             <w:r>
-              <w:t xml:space="preserve">: JWT, </w:t>
-            </w:r>
-            <w:proofErr w:type="spellStart"/>
-            <w:r>
-              <w:t>BCrypt</w:t>
-            </w:r>
-            <w:proofErr w:type="spellEnd"/>
-            <w:r>
-              <w:t xml:space="preserve"> and role-based authorization</w:t>
+              <w:t>: JWT, BCrypt and role-based authorization</w:t>
             </w:r>
           </w:p>
           <w:p>
@@ -4453,39 +4030,7 @@
               <w:t>Testing</w:t>
             </w:r>
             <w:r>
-              <w:t xml:space="preserve">: </w:t>
-            </w:r>
-            <w:proofErr w:type="spellStart"/>
-            <w:r>
-              <w:t>NUnit</w:t>
-            </w:r>
-            <w:proofErr w:type="spellEnd"/>
-            <w:r>
-              <w:t xml:space="preserve">, </w:t>
-            </w:r>
-            <w:proofErr w:type="spellStart"/>
-            <w:r>
-              <w:t>Moq</w:t>
-            </w:r>
-            <w:proofErr w:type="spellEnd"/>
-            <w:r>
-              <w:t xml:space="preserve">, </w:t>
-            </w:r>
-            <w:proofErr w:type="spellStart"/>
-            <w:r>
-              <w:t>FluentAssertions</w:t>
-            </w:r>
-            <w:proofErr w:type="spellEnd"/>
-            <w:r>
-              <w:t xml:space="preserve">, </w:t>
-            </w:r>
-            <w:proofErr w:type="spellStart"/>
-            <w:r>
-              <w:t>Vitest</w:t>
-            </w:r>
-            <w:proofErr w:type="spellEnd"/>
-            <w:r>
-              <w:t>, Playwright, Flutter Test and integration tests</w:t>
+              <w:t>: NUnit, Moq, FluentAssertions, Vitest, Playwright, Flutter Test and integration tests</w:t>
             </w:r>
           </w:p>
           <w:p>
@@ -4576,9 +4121,6 @@
                 <w:numId w:val="2"/>
               </w:numPr>
               <w:spacing w:after="60"/>
-              <w:rPr>
-                <w:lang w:val="it-IT"/>
-              </w:rPr>
             </w:pPr>
             <w:r>
               <w:rPr>
@@ -4594,12 +4136,6 @@
         </w:tc>
       </w:tr>
       <w:tr>
-        <w:tblPrEx>
-          <w:tblCellMar>
-            <w:top w:w="0" w:type="dxa"/>
-            <w:bottom w:w="0" w:type="dxa"/>
-          </w:tblCellMar>
-        </w:tblPrEx>
         <w:tc>
           <w:tcPr>
             <w:tcW w:w="9372" w:type="dxa"/>
@@ -4689,7 +4225,6 @@
               <w:spacing w:after="100"/>
             </w:pPr>
             <w:r>
-              <w:lastRenderedPageBreak/>
               <w:t>All AI-assisted output is reviewed, tested and modified by the student, who remains responsible for requirements, architecture, implementation, testing and security decisions.</w:t>
             </w:r>
           </w:p>
@@ -4705,7 +4240,11 @@
               <w:t>Declaration</w:t>
             </w:r>
             <w:r>
-              <w:t>: I understand that, regardless of AI tool use, I am required to disclose such use in my project report, and I must be able to independently explain, defend, and modify any part of my code — including any AI-assisted sections — during the midterm and final presentations, live defense, and supervisor meetings throughout the semester. I understand that submitting AI-generated work I cannot explain or defend may result in a reduced grade or other academic consequences.</w:t>
+              <w:t>: I understand that, regardless of AI tool use, I am required to disclose such use in my project report, and I must be able to independently explain, defend, and modify any part of my code — including any AI-</w:t>
+            </w:r>
+            <w:r>
+              <w:lastRenderedPageBreak/>
+              <w:t>assisted sections — during the midterm and final presentations, live defense, and supervisor meetings throughout the semester. I understand that submitting AI-generated work I cannot explain or defend may result in a reduced grade or other academic consequences.</w:t>
             </w:r>
           </w:p>
           <w:p>
@@ -4741,12 +4280,6 @@
         </w:tc>
       </w:tr>
       <w:tr>
-        <w:tblPrEx>
-          <w:tblCellMar>
-            <w:top w:w="0" w:type="dxa"/>
-            <w:bottom w:w="0" w:type="dxa"/>
-          </w:tblCellMar>
-        </w:tblPrEx>
         <w:tc>
           <w:tcPr>
             <w:tcW w:w="9372" w:type="dxa"/>
@@ -4801,12 +4334,6 @@
         </w:tc>
       </w:tr>
       <w:tr>
-        <w:tblPrEx>
-          <w:tblCellMar>
-            <w:top w:w="0" w:type="dxa"/>
-            <w:bottom w:w="0" w:type="dxa"/>
-          </w:tblCellMar>
-        </w:tblPrEx>
         <w:tc>
           <w:tcPr>
             <w:tcW w:w="9372" w:type="dxa"/>
@@ -4872,12 +4399,6 @@
         </w:tc>
       </w:tr>
       <w:tr>
-        <w:tblPrEx>
-          <w:tblCellMar>
-            <w:top w:w="0" w:type="dxa"/>
-            <w:bottom w:w="0" w:type="dxa"/>
-          </w:tblCellMar>
-        </w:tblPrEx>
         <w:tc>
           <w:tcPr>
             <w:tcW w:w="9372" w:type="dxa"/>
@@ -4961,12 +4482,6 @@
         </w:tc>
       </w:tr>
       <w:tr>
-        <w:tblPrEx>
-          <w:tblCellMar>
-            <w:top w:w="0" w:type="dxa"/>
-            <w:bottom w:w="0" w:type="dxa"/>
-          </w:tblCellMar>
-        </w:tblPrEx>
         <w:tc>
           <w:tcPr>
             <w:tcW w:w="9372" w:type="dxa"/>
@@ -5050,12 +4565,6 @@
         </w:tc>
       </w:tr>
       <w:tr>
-        <w:tblPrEx>
-          <w:tblCellMar>
-            <w:top w:w="0" w:type="dxa"/>
-            <w:bottom w:w="0" w:type="dxa"/>
-          </w:tblCellMar>
-        </w:tblPrEx>
         <w:tc>
           <w:tcPr>
             <w:tcW w:w="9372" w:type="dxa"/>
@@ -6217,7 +5726,6 @@
   <w:style w:type="character" w:default="1" w:styleId="DefaultParagraphFont">
     <w:name w:val="Default Paragraph Font"/>
     <w:uiPriority w:val="1"/>
-    <w:semiHidden/>
     <w:unhideWhenUsed/>
   </w:style>
   <w:style w:type="table" w:default="1" w:styleId="TableNormal">

</xml_diff>

<commit_message>
doc: proposal presentation containter docs updated
</commit_message>
<xml_diff>
--- a/docs/proposal-docs/EMIT_Project-Proposal-Form_Updated.docx
+++ b/docs/proposal-docs/EMIT_Project-Proposal-Form_Updated.docx
@@ -774,12 +774,16 @@
           <w:p>
             <w:pPr>
               <w:spacing w:after="100"/>
-            </w:pPr>
-            <w:r>
               <w:rPr>
                 <w:b/>
                 <w:bCs/>
               </w:rPr>
+            </w:pPr>
+            <w:r>
+              <w:rPr>
+                <w:b/>
+                <w:bCs/>
+              </w:rPr>
               <w:t>Non-functional requirements</w:t>
             </w:r>
             <w:r>
@@ -789,6 +793,230 @@
               <w:lastRenderedPageBreak/>
               <w:t>invalidation on status change, dependency-failure isolation, architecture-rule enforcement and recovery time. The prototype already includes the backend, web app, mobile app, authentication, accounting, membership, events, governance and CI/CD. Remaining work covers traceability closure, measured coverage, security and usability evidence, performance evaluation and documentation.</w:t>
             </w:r>
+            <w:r>
+              <w:br/>
+            </w:r>
+            <w:r>
+              <w:br/>
+            </w:r>
+            <w:r>
+              <w:rPr>
+                <w:b/>
+                <w:bCs/>
+              </w:rPr>
+              <w:t>Development approach</w:t>
+            </w:r>
+          </w:p>
+          <w:p>
+            <w:pPr>
+              <w:spacing w:after="100"/>
+            </w:pPr>
+            <w:r>
+              <w:t>The project uses Design Science Research with incremental software development:</w:t>
+            </w:r>
+          </w:p>
+          <w:p>
+            <w:pPr>
+              <w:numPr>
+                <w:ilvl w:val="0"/>
+                <w:numId w:val="6"/>
+              </w:numPr>
+            </w:pPr>
+            <w:r>
+              <w:t>specify the requirement and acceptance condition;</w:t>
+            </w:r>
+          </w:p>
+          <w:p>
+            <w:pPr>
+              <w:numPr>
+                <w:ilvl w:val="0"/>
+                <w:numId w:val="6"/>
+              </w:numPr>
+            </w:pPr>
+            <w:r>
+              <w:t>model the workflow, state or business rule;</w:t>
+            </w:r>
+          </w:p>
+          <w:p>
+            <w:pPr>
+              <w:numPr>
+                <w:ilvl w:val="0"/>
+                <w:numId w:val="6"/>
+              </w:numPr>
+            </w:pPr>
+            <w:r>
+              <w:t>implement it across the required layers;</w:t>
+            </w:r>
+          </w:p>
+          <w:p>
+            <w:pPr>
+              <w:numPr>
+                <w:ilvl w:val="0"/>
+                <w:numId w:val="6"/>
+              </w:numPr>
+            </w:pPr>
+            <w:r>
+              <w:t>test the implementation;</w:t>
+            </w:r>
+          </w:p>
+          <w:p>
+            <w:pPr>
+              <w:numPr>
+                <w:ilvl w:val="0"/>
+                <w:numId w:val="6"/>
+              </w:numPr>
+            </w:pPr>
+            <w:r>
+              <w:t>trace the requirement to its evidence;</w:t>
+            </w:r>
+          </w:p>
+          <w:p>
+            <w:pPr>
+              <w:numPr>
+                <w:ilvl w:val="0"/>
+                <w:numId w:val="6"/>
+              </w:numPr>
+            </w:pPr>
+            <w:r>
+              <w:t>evaluate the result and record limitations.</w:t>
+            </w:r>
+          </w:p>
+          <w:p>
+            <w:pPr>
+              <w:spacing w:after="100"/>
+            </w:pPr>
+            <w:r>
+              <w:t>Specification-driven development is supported by a requirements traceability matrix, use cases, quality-attribute scenarios, domain constraints, acceptance criteria and tests. The architecture is evaluated against measurable scenarios rather than selected only for implementation convenience.</w:t>
+            </w:r>
+          </w:p>
+          <w:p>
+            <w:pPr>
+              <w:spacing w:after="100"/>
+            </w:pPr>
+            <w:r>
+              <w:t xml:space="preserve">The design uses Clean Architecture, dependency inversion, dependency injection, explicit application contracts and DTOs, typed API communication, role-based access control, boundary validation, global archive/query-filter </w:t>
+            </w:r>
+            <w:r>
+              <w:t>behavior</w:t>
+            </w:r>
+            <w:r>
+              <w:t xml:space="preserve">, </w:t>
+            </w:r>
+            <w:r>
+              <w:t>centralized</w:t>
+            </w:r>
+            <w:r>
+              <w:t xml:space="preserve"> design tokens, reusable controls, configuration-driven </w:t>
+            </w:r>
+            <w:r>
+              <w:t>organization</w:t>
+            </w:r>
+            <w:r>
+              <w:t xml:space="preserve"> profiles and shared services instead of duplicated feature logic.</w:t>
+            </w:r>
+          </w:p>
+          <w:p>
+            <w:pPr>
+              <w:spacing w:after="100"/>
+              <w:rPr>
+                <w:b/>
+                <w:bCs/>
+              </w:rPr>
+            </w:pPr>
+          </w:p>
+          <w:p>
+            <w:pPr>
+              <w:spacing w:after="100"/>
+            </w:pPr>
+            <w:r>
+              <w:rPr>
+                <w:b/>
+                <w:bCs/>
+              </w:rPr>
+              <w:t>Testing, coverage and evaluation</w:t>
+            </w:r>
+          </w:p>
+          <w:p>
+            <w:pPr>
+              <w:spacing w:after="100"/>
+            </w:pPr>
+            <w:r>
+              <w:t>The project uses backend unit tests for services, validators and business rules; backend integration tests for database and API behavior; EF Core SQLite and in-memory test configurations; Angular unit tests using Vitest; Flutter widget and service tests; Playwright end-to-end tests; authentication, authorization and privacy tests; API contract and compatibility checks; selected visual regression tests; and static analysis, type checking and build verification. Evidence includes backend statement and branch coverage through Coverlet, requirement coverage through the traceability matrix, critical business-rule tests, API and end-to-end results, security assessment, usability findings, performance measurements, maintainability evidence and deployment-cost assessment.</w:t>
+            </w:r>
+          </w:p>
+          <w:p>
+            <w:pPr>
+              <w:spacing w:after="100"/>
+            </w:pPr>
+            <w:r>
+              <w:t>The quality scenarios include directory latency, cold mobile page load, session invalidation, authorization isolation, dependency-failure containment, maintainer change effort, architecture-rule enforcement, recovery time, accessibility and vote replay rejection. These scenarios make proposals about verifiable system qualities, not only stored records and screens. Results will be reported by suite and requirement category. No unsupported combined coverage percentage will be claimed. The intended target is that all Must requirements are traced to passing tests; requirements without sufficient evidence will be reported as uncovered or limited.</w:t>
+            </w:r>
+          </w:p>
+          <w:p>
+            <w:pPr>
+              <w:spacing w:after="100"/>
+              <w:rPr>
+                <w:b/>
+                <w:bCs/>
+              </w:rPr>
+            </w:pPr>
+          </w:p>
+          <w:p>
+            <w:pPr>
+              <w:spacing w:after="100"/>
+              <w:rPr>
+                <w:b/>
+                <w:bCs/>
+              </w:rPr>
+            </w:pPr>
+            <w:r>
+              <w:rPr>
+                <w:b/>
+                <w:bCs/>
+              </w:rPr>
+              <w:t>Requirements engineering and specification-driven development</w:t>
+            </w:r>
+          </w:p>
+          <w:p>
+            <w:pPr>
+              <w:spacing w:after="100"/>
+            </w:pPr>
+            <w:r>
+              <w:t>Requirements are handled as an engineering activity with its own outputs, not as notes kept before coding. They are elicited from four sources: stakeholder interviews, the Association's current manual process, its constitution and election documents, and software-engineering standards. They are specified to ISO/IEC/IEEE 29148 in the "shall" form, each with an identifier, source and priority. Quality requirements are classified by ISO/IEC 25010 and restated as testable quality-attribute scenarios. Constitutional rules become domain constraints that the software must not break, and stakeholders cannot negotiate them away. Requirements are prioritised with MoSCoW and validated by formal technical review.</w:t>
+            </w:r>
+          </w:p>
+          <w:p>
+            <w:pPr>
+              <w:spacing w:after="100"/>
+            </w:pPr>
+            <w:r>
+              <w:t>Specification-driven development is carried out with GitHub Spec Kit. A short specification constitution sets five rules every spec must follow: keep the existing product contract, trace shared behaviour across the API, web and mobile clients, keep layer boundaries clear, treat security and privacy as requirements, and back every claim with a repository check. The work proceeds in Spec Kit's order: specify, clarify, plan, break into tasks, implement. Each domain spec holds user stories with acceptance scenarios, functional requirements, success criteria, an evidence table linking each requirement to its controller, service, screens and test, and a gaps list for requirements that have no test yet.</w:t>
+            </w:r>
+          </w:p>
+          <w:p>
+            <w:pPr>
+              <w:spacing w:after="100"/>
+            </w:pPr>
+            <w:r>
+              <w:t xml:space="preserve">The evaluation reports how far the specs and the code agree. That covers requirements with passing tests, requirements with only a recorded gap, and open clarification points. The specs for the existing modules were </w:t>
+            </w:r>
+            <w:r>
+              <w:lastRenderedPageBreak/>
+              <w:t>written from the code after it was built, and the evaluation will say so rather than present them as having driven the build.</w:t>
+            </w:r>
+          </w:p>
+          <w:p>
+            <w:pPr>
+              <w:spacing w:after="100"/>
+            </w:pPr>
+            <w:r>
+              <w:t>The application is packaged as a deployable .NET and Angular service. PostgreSQL is used for hosted deployment, SQLite for local development and tests, and database migrations are applied through the migration bootstrap process.</w:t>
+            </w:r>
+          </w:p>
+          <w:p>
+            <w:pPr>
+              <w:spacing w:after="100"/>
+            </w:pPr>
           </w:p>
           <w:p>
             <w:pPr>
@@ -3782,7 +4010,7 @@
                           <pic:cNvPicPr/>
                         </pic:nvPicPr>
                         <pic:blipFill>
-                          <a:blip r:embed="rId5"/>
+                          <a:blip r:embed="rId7"/>
                           <a:stretch>
                             <a:fillRect/>
                           </a:stretch>
@@ -4725,6 +4953,44 @@
 </w:document>
 </file>
 
+<file path=word/endnotes.xml><?xml version="1.0" encoding="utf-8"?>
+<w:endnotes xmlns:wpc="http://schemas.microsoft.com/office/word/2010/wordprocessingCanvas" xmlns:cx="http://schemas.microsoft.com/office/drawing/2014/chartex" xmlns:cx1="http://schemas.microsoft.com/office/drawing/2015/9/8/chartex" xmlns:cx2="http://schemas.microsoft.com/office/drawing/2015/10/21/chartex" xmlns:cx3="http://schemas.microsoft.com/office/drawing/2016/5/9/chartex" xmlns:cx4="http://schemas.microsoft.com/office/drawing/2016/5/10/chartex" xmlns:cx5="http://schemas.microsoft.com/office/drawing/2016/5/11/chartex" xmlns:cx6="http://schemas.microsoft.com/office/drawing/2016/5/12/chartex" xmlns:cx7="http://schemas.microsoft.com/office/drawing/2016/5/13/chartex" xmlns:cx8="http://schemas.microsoft.com/office/drawing/2016/5/14/chartex" xmlns:mc="http://schemas.openxmlformats.org/markup-compatibility/2006" xmlns:aink="http://schemas.microsoft.com/office/drawing/2016/ink" xmlns:am3d="http://schemas.microsoft.com/office/drawing/2017/model3d" xmlns:o="urn:schemas-microsoft-com:office:office" xmlns:oel="http://schemas.microsoft.com/office/2019/extlst" xmlns:r="http://schemas.openxmlformats.org/officeDocument/2006/relationships" xmlns:m="http://schemas.openxmlformats.org/officeDocument/2006/math" xmlns:v="urn:schemas-microsoft-com:vml" xmlns:wp14="http://schemas.microsoft.com/office/word/2010/wordprocessingDrawing" xmlns:wp="http://schemas.openxmlformats.org/drawingml/2006/wordprocessingDrawing" xmlns:w10="urn:schemas-microsoft-com:office:word" xmlns:w="http://schemas.openxmlformats.org/wordprocessingml/2006/main" xmlns:w14="http://schemas.microsoft.com/office/word/2010/wordml" xmlns:w15="http://schemas.microsoft.com/office/word/2012/wordml" xmlns:w16cex="http://schemas.microsoft.com/office/word/2018/wordml/cex" xmlns:w16cid="http://schemas.microsoft.com/office/word/2016/wordml/cid" xmlns:w16="http://schemas.microsoft.com/office/word/2018/wordml" xmlns:w16du="http://schemas.microsoft.com/office/word/2023/wordml/word16du" xmlns:w16sdtdh="http://schemas.microsoft.com/office/word/2020/wordml/sdtdatahash" xmlns:w16sdtfl="http://schemas.microsoft.com/office/word/2024/wordml/sdtformatlock" xmlns:w16se="http://schemas.microsoft.com/office/word/2015/wordml/symex" xmlns:wpg="http://schemas.microsoft.com/office/word/2010/wordprocessingGroup" xmlns:wpi="http://schemas.microsoft.com/office/word/2010/wordprocessingInk" xmlns:wne="http://schemas.microsoft.com/office/word/2006/wordml" xmlns:wps="http://schemas.microsoft.com/office/word/2010/wordprocessingShape" mc:Ignorable="w14 w15 w16se w16cid w16 w16cex w16sdtdh w16sdtfl w16du wp14">
+  <w:endnote w:type="separator" w:id="-1">
+    <w:p>
+      <w:r>
+        <w:separator/>
+      </w:r>
+    </w:p>
+  </w:endnote>
+  <w:endnote w:type="continuationSeparator" w:id="0">
+    <w:p>
+      <w:r>
+        <w:continuationSeparator/>
+      </w:r>
+    </w:p>
+  </w:endnote>
+</w:endnotes>
+</file>
+
+<file path=word/footnotes.xml><?xml version="1.0" encoding="utf-8"?>
+<w:footnotes xmlns:wpc="http://schemas.microsoft.com/office/word/2010/wordprocessingCanvas" xmlns:cx="http://schemas.microsoft.com/office/drawing/2014/chartex" xmlns:cx1="http://schemas.microsoft.com/office/drawing/2015/9/8/chartex" xmlns:cx2="http://schemas.microsoft.com/office/drawing/2015/10/21/chartex" xmlns:cx3="http://schemas.microsoft.com/office/drawing/2016/5/9/chartex" xmlns:cx4="http://schemas.microsoft.com/office/drawing/2016/5/10/chartex" xmlns:cx5="http://schemas.microsoft.com/office/drawing/2016/5/11/chartex" xmlns:cx6="http://schemas.microsoft.com/office/drawing/2016/5/12/chartex" xmlns:cx7="http://schemas.microsoft.com/office/drawing/2016/5/13/chartex" xmlns:cx8="http://schemas.microsoft.com/office/drawing/2016/5/14/chartex" xmlns:mc="http://schemas.openxmlformats.org/markup-compatibility/2006" xmlns:aink="http://schemas.microsoft.com/office/drawing/2016/ink" xmlns:am3d="http://schemas.microsoft.com/office/drawing/2017/model3d" xmlns:o="urn:schemas-microsoft-com:office:office" xmlns:oel="http://schemas.microsoft.com/office/2019/extlst" xmlns:r="http://schemas.openxmlformats.org/officeDocument/2006/relationships" xmlns:m="http://schemas.openxmlformats.org/officeDocument/2006/math" xmlns:v="urn:schemas-microsoft-com:vml" xmlns:wp14="http://schemas.microsoft.com/office/word/2010/wordprocessingDrawing" xmlns:wp="http://schemas.openxmlformats.org/drawingml/2006/wordprocessingDrawing" xmlns:w10="urn:schemas-microsoft-com:office:word" xmlns:w="http://schemas.openxmlformats.org/wordprocessingml/2006/main" xmlns:w14="http://schemas.microsoft.com/office/word/2010/wordml" xmlns:w15="http://schemas.microsoft.com/office/word/2012/wordml" xmlns:w16cex="http://schemas.microsoft.com/office/word/2018/wordml/cex" xmlns:w16cid="http://schemas.microsoft.com/office/word/2016/wordml/cid" xmlns:w16="http://schemas.microsoft.com/office/word/2018/wordml" xmlns:w16du="http://schemas.microsoft.com/office/word/2023/wordml/word16du" xmlns:w16sdtdh="http://schemas.microsoft.com/office/word/2020/wordml/sdtdatahash" xmlns:w16sdtfl="http://schemas.microsoft.com/office/word/2024/wordml/sdtformatlock" xmlns:w16se="http://schemas.microsoft.com/office/word/2015/wordml/symex" xmlns:wpg="http://schemas.microsoft.com/office/word/2010/wordprocessingGroup" xmlns:wpi="http://schemas.microsoft.com/office/word/2010/wordprocessingInk" xmlns:wne="http://schemas.microsoft.com/office/word/2006/wordml" xmlns:wps="http://schemas.microsoft.com/office/word/2010/wordprocessingShape" mc:Ignorable="w14 w15 w16se w16cid w16 w16cex w16sdtdh w16sdtfl w16du wp14">
+  <w:footnote w:type="separator" w:id="-1">
+    <w:p>
+      <w:r>
+        <w:separator/>
+      </w:r>
+    </w:p>
+  </w:footnote>
+  <w:footnote w:type="continuationSeparator" w:id="0">
+    <w:p>
+      <w:r>
+        <w:continuationSeparator/>
+      </w:r>
+    </w:p>
+  </w:footnote>
+</w:footnotes>
+</file>
+
 <file path=word/numbering.xml><?xml version="1.0" encoding="utf-8"?>
 <w:numbering xmlns:wpc="http://schemas.microsoft.com/office/word/2010/wordprocessingCanvas" xmlns:cx="http://schemas.microsoft.com/office/drawing/2014/chartex" xmlns:cx1="http://schemas.microsoft.com/office/drawing/2015/9/8/chartex" xmlns:cx2="http://schemas.microsoft.com/office/drawing/2015/10/21/chartex" xmlns:cx3="http://schemas.microsoft.com/office/drawing/2016/5/9/chartex" xmlns:cx4="http://schemas.microsoft.com/office/drawing/2016/5/10/chartex" xmlns:cx5="http://schemas.microsoft.com/office/drawing/2016/5/11/chartex" xmlns:cx6="http://schemas.microsoft.com/office/drawing/2016/5/12/chartex" xmlns:cx7="http://schemas.microsoft.com/office/drawing/2016/5/13/chartex" xmlns:cx8="http://schemas.microsoft.com/office/drawing/2016/5/14/chartex" xmlns:mc="http://schemas.openxmlformats.org/markup-compatibility/2006" xmlns:aink="http://schemas.microsoft.com/office/drawing/2016/ink" xmlns:am3d="http://schemas.microsoft.com/office/drawing/2017/model3d" xmlns:o="urn:schemas-microsoft-com:office:office" xmlns:oel="http://schemas.microsoft.com/office/2019/extlst" xmlns:r="http://schemas.openxmlformats.org/officeDocument/2006/relationships" xmlns:m="http://schemas.openxmlformats.org/officeDocument/2006/math" xmlns:v="urn:schemas-microsoft-com:vml" xmlns:wp14="http://schemas.microsoft.com/office/word/2010/wordprocessingDrawing" xmlns:wp="http://schemas.openxmlformats.org/drawingml/2006/wordprocessingDrawing" xmlns:w10="urn:schemas-microsoft-com:office:word" xmlns:w="http://schemas.openxmlformats.org/wordprocessingml/2006/main" xmlns:w14="http://schemas.microsoft.com/office/word/2010/wordml" xmlns:w15="http://schemas.microsoft.com/office/word/2012/wordml" xmlns:w16cex="http://schemas.microsoft.com/office/word/2018/wordml/cex" xmlns:w16cid="http://schemas.microsoft.com/office/word/2016/wordml/cid" xmlns:w16="http://schemas.microsoft.com/office/word/2018/wordml" xmlns:w16du="http://schemas.microsoft.com/office/word/2023/wordml/word16du" xmlns:w16sdtdh="http://schemas.microsoft.com/office/word/2020/wordml/sdtdatahash" xmlns:w16sdtfl="http://schemas.microsoft.com/office/word/2024/wordml/sdtformatlock" xmlns:w16se="http://schemas.microsoft.com/office/word/2015/wordml/symex" xmlns:wpg="http://schemas.microsoft.com/office/word/2010/wordprocessingGroup" xmlns:wpi="http://schemas.microsoft.com/office/word/2010/wordprocessingInk" xmlns:wne="http://schemas.microsoft.com/office/word/2006/wordml" xmlns:wps="http://schemas.microsoft.com/office/word/2010/wordprocessingShape" mc:Ignorable="w14 w15 w16se w16cid w16 w16cex w16sdtdh w16sdtfl w16du wp14">
   <w:abstractNum w:abstractNumId="0" w15:restartNumberingAfterBreak="0">
@@ -4868,6 +5134,232 @@
     </w:lvl>
   </w:abstractNum>
   <w:abstractNum w:abstractNumId="2" w15:restartNumberingAfterBreak="0">
+    <w:nsid w:val="07933C92"/>
+    <w:multiLevelType w:val="multilevel"/>
+    <w:tmpl w:val="F75E6284"/>
+    <w:lvl w:ilvl="0">
+      <w:start w:val="1"/>
+      <w:numFmt w:val="decimal"/>
+      <w:lvlText w:val="%1."/>
+      <w:lvlJc w:val="left"/>
+      <w:pPr>
+        <w:tabs>
+          <w:tab w:val="num" w:pos="720"/>
+        </w:tabs>
+        <w:ind w:left="720" w:hanging="360"/>
+      </w:pPr>
+    </w:lvl>
+    <w:lvl w:ilvl="1" w:tentative="1">
+      <w:start w:val="1"/>
+      <w:numFmt w:val="decimal"/>
+      <w:lvlText w:val="%2."/>
+      <w:lvlJc w:val="left"/>
+      <w:pPr>
+        <w:tabs>
+          <w:tab w:val="num" w:pos="1440"/>
+        </w:tabs>
+        <w:ind w:left="1440" w:hanging="360"/>
+      </w:pPr>
+    </w:lvl>
+    <w:lvl w:ilvl="2" w:tentative="1">
+      <w:start w:val="1"/>
+      <w:numFmt w:val="decimal"/>
+      <w:lvlText w:val="%3."/>
+      <w:lvlJc w:val="left"/>
+      <w:pPr>
+        <w:tabs>
+          <w:tab w:val="num" w:pos="2160"/>
+        </w:tabs>
+        <w:ind w:left="2160" w:hanging="360"/>
+      </w:pPr>
+    </w:lvl>
+    <w:lvl w:ilvl="3" w:tentative="1">
+      <w:start w:val="1"/>
+      <w:numFmt w:val="decimal"/>
+      <w:lvlText w:val="%4."/>
+      <w:lvlJc w:val="left"/>
+      <w:pPr>
+        <w:tabs>
+          <w:tab w:val="num" w:pos="2880"/>
+        </w:tabs>
+        <w:ind w:left="2880" w:hanging="360"/>
+      </w:pPr>
+    </w:lvl>
+    <w:lvl w:ilvl="4" w:tentative="1">
+      <w:start w:val="1"/>
+      <w:numFmt w:val="decimal"/>
+      <w:lvlText w:val="%5."/>
+      <w:lvlJc w:val="left"/>
+      <w:pPr>
+        <w:tabs>
+          <w:tab w:val="num" w:pos="3600"/>
+        </w:tabs>
+        <w:ind w:left="3600" w:hanging="360"/>
+      </w:pPr>
+    </w:lvl>
+    <w:lvl w:ilvl="5" w:tentative="1">
+      <w:start w:val="1"/>
+      <w:numFmt w:val="decimal"/>
+      <w:lvlText w:val="%6."/>
+      <w:lvlJc w:val="left"/>
+      <w:pPr>
+        <w:tabs>
+          <w:tab w:val="num" w:pos="4320"/>
+        </w:tabs>
+        <w:ind w:left="4320" w:hanging="360"/>
+      </w:pPr>
+    </w:lvl>
+    <w:lvl w:ilvl="6" w:tentative="1">
+      <w:start w:val="1"/>
+      <w:numFmt w:val="decimal"/>
+      <w:lvlText w:val="%7."/>
+      <w:lvlJc w:val="left"/>
+      <w:pPr>
+        <w:tabs>
+          <w:tab w:val="num" w:pos="5040"/>
+        </w:tabs>
+        <w:ind w:left="5040" w:hanging="360"/>
+      </w:pPr>
+    </w:lvl>
+    <w:lvl w:ilvl="7" w:tentative="1">
+      <w:start w:val="1"/>
+      <w:numFmt w:val="decimal"/>
+      <w:lvlText w:val="%8."/>
+      <w:lvlJc w:val="left"/>
+      <w:pPr>
+        <w:tabs>
+          <w:tab w:val="num" w:pos="5760"/>
+        </w:tabs>
+        <w:ind w:left="5760" w:hanging="360"/>
+      </w:pPr>
+    </w:lvl>
+    <w:lvl w:ilvl="8" w:tentative="1">
+      <w:start w:val="1"/>
+      <w:numFmt w:val="decimal"/>
+      <w:lvlText w:val="%9."/>
+      <w:lvlJc w:val="left"/>
+      <w:pPr>
+        <w:tabs>
+          <w:tab w:val="num" w:pos="6480"/>
+        </w:tabs>
+        <w:ind w:left="6480" w:hanging="360"/>
+      </w:pPr>
+    </w:lvl>
+  </w:abstractNum>
+  <w:abstractNum w:abstractNumId="3" w15:restartNumberingAfterBreak="0">
+    <w:nsid w:val="1F443654"/>
+    <w:multiLevelType w:val="multilevel"/>
+    <w:tmpl w:val="0A8E33D8"/>
+    <w:lvl w:ilvl="0">
+      <w:start w:val="1"/>
+      <w:numFmt w:val="decimal"/>
+      <w:lvlText w:val="%1."/>
+      <w:lvlJc w:val="left"/>
+      <w:pPr>
+        <w:tabs>
+          <w:tab w:val="num" w:pos="720"/>
+        </w:tabs>
+        <w:ind w:left="720" w:hanging="360"/>
+      </w:pPr>
+    </w:lvl>
+    <w:lvl w:ilvl="1" w:tentative="1">
+      <w:start w:val="1"/>
+      <w:numFmt w:val="decimal"/>
+      <w:lvlText w:val="%2."/>
+      <w:lvlJc w:val="left"/>
+      <w:pPr>
+        <w:tabs>
+          <w:tab w:val="num" w:pos="1440"/>
+        </w:tabs>
+        <w:ind w:left="1440" w:hanging="360"/>
+      </w:pPr>
+    </w:lvl>
+    <w:lvl w:ilvl="2" w:tentative="1">
+      <w:start w:val="1"/>
+      <w:numFmt w:val="decimal"/>
+      <w:lvlText w:val="%3."/>
+      <w:lvlJc w:val="left"/>
+      <w:pPr>
+        <w:tabs>
+          <w:tab w:val="num" w:pos="2160"/>
+        </w:tabs>
+        <w:ind w:left="2160" w:hanging="360"/>
+      </w:pPr>
+    </w:lvl>
+    <w:lvl w:ilvl="3" w:tentative="1">
+      <w:start w:val="1"/>
+      <w:numFmt w:val="decimal"/>
+      <w:lvlText w:val="%4."/>
+      <w:lvlJc w:val="left"/>
+      <w:pPr>
+        <w:tabs>
+          <w:tab w:val="num" w:pos="2880"/>
+        </w:tabs>
+        <w:ind w:left="2880" w:hanging="360"/>
+      </w:pPr>
+    </w:lvl>
+    <w:lvl w:ilvl="4" w:tentative="1">
+      <w:start w:val="1"/>
+      <w:numFmt w:val="decimal"/>
+      <w:lvlText w:val="%5."/>
+      <w:lvlJc w:val="left"/>
+      <w:pPr>
+        <w:tabs>
+          <w:tab w:val="num" w:pos="3600"/>
+        </w:tabs>
+        <w:ind w:left="3600" w:hanging="360"/>
+      </w:pPr>
+    </w:lvl>
+    <w:lvl w:ilvl="5" w:tentative="1">
+      <w:start w:val="1"/>
+      <w:numFmt w:val="decimal"/>
+      <w:lvlText w:val="%6."/>
+      <w:lvlJc w:val="left"/>
+      <w:pPr>
+        <w:tabs>
+          <w:tab w:val="num" w:pos="4320"/>
+        </w:tabs>
+        <w:ind w:left="4320" w:hanging="360"/>
+      </w:pPr>
+    </w:lvl>
+    <w:lvl w:ilvl="6" w:tentative="1">
+      <w:start w:val="1"/>
+      <w:numFmt w:val="decimal"/>
+      <w:lvlText w:val="%7."/>
+      <w:lvlJc w:val="left"/>
+      <w:pPr>
+        <w:tabs>
+          <w:tab w:val="num" w:pos="5040"/>
+        </w:tabs>
+        <w:ind w:left="5040" w:hanging="360"/>
+      </w:pPr>
+    </w:lvl>
+    <w:lvl w:ilvl="7" w:tentative="1">
+      <w:start w:val="1"/>
+      <w:numFmt w:val="decimal"/>
+      <w:lvlText w:val="%8."/>
+      <w:lvlJc w:val="left"/>
+      <w:pPr>
+        <w:tabs>
+          <w:tab w:val="num" w:pos="5760"/>
+        </w:tabs>
+        <w:ind w:left="5760" w:hanging="360"/>
+      </w:pPr>
+    </w:lvl>
+    <w:lvl w:ilvl="8" w:tentative="1">
+      <w:start w:val="1"/>
+      <w:numFmt w:val="decimal"/>
+      <w:lvlText w:val="%9."/>
+      <w:lvlJc w:val="left"/>
+      <w:pPr>
+        <w:tabs>
+          <w:tab w:val="num" w:pos="6480"/>
+        </w:tabs>
+        <w:ind w:left="6480" w:hanging="360"/>
+      </w:pPr>
+    </w:lvl>
+  </w:abstractNum>
+  <w:abstractNum w:abstractNumId="4" w15:restartNumberingAfterBreak="0">
     <w:nsid w:val="4A946425"/>
     <w:multiLevelType w:val="multilevel"/>
     <w:tmpl w:val="43A4816C"/>
@@ -5016,7 +5508,7 @@
       </w:rPr>
     </w:lvl>
   </w:abstractNum>
-  <w:abstractNum w:abstractNumId="3" w15:restartNumberingAfterBreak="0">
+  <w:abstractNum w:abstractNumId="5" w15:restartNumberingAfterBreak="0">
     <w:nsid w:val="5FAD39CE"/>
     <w:multiLevelType w:val="hybridMultilevel"/>
     <w:tmpl w:val="ADC02652"/>
@@ -5070,10 +5562,159 @@
       <w:lvlJc w:val="left"/>
     </w:lvl>
   </w:abstractNum>
-  <w:abstractNum w:abstractNumId="4" w15:restartNumberingAfterBreak="0">
+  <w:abstractNum w:abstractNumId="6" w15:restartNumberingAfterBreak="0">
     <w:nsid w:val="77095D68"/>
     <w:multiLevelType w:val="multilevel"/>
     <w:tmpl w:val="34F61270"/>
+    <w:lvl w:ilvl="0">
+      <w:start w:val="1"/>
+      <w:numFmt w:val="bullet"/>
+      <w:lvlText w:val=""/>
+      <w:lvlJc w:val="left"/>
+      <w:pPr>
+        <w:tabs>
+          <w:tab w:val="num" w:pos="720"/>
+        </w:tabs>
+        <w:ind w:left="720" w:hanging="360"/>
+      </w:pPr>
+      <w:rPr>
+        <w:rFonts w:ascii="Symbol" w:hAnsi="Symbol" w:hint="default"/>
+        <w:sz w:val="20"/>
+      </w:rPr>
+    </w:lvl>
+    <w:lvl w:ilvl="1" w:tentative="1">
+      <w:start w:val="1"/>
+      <w:numFmt w:val="bullet"/>
+      <w:lvlText w:val="o"/>
+      <w:lvlJc w:val="left"/>
+      <w:pPr>
+        <w:tabs>
+          <w:tab w:val="num" w:pos="1440"/>
+        </w:tabs>
+        <w:ind w:left="1440" w:hanging="360"/>
+      </w:pPr>
+      <w:rPr>
+        <w:rFonts w:ascii="Courier New" w:hAnsi="Courier New" w:hint="default"/>
+        <w:sz w:val="20"/>
+      </w:rPr>
+    </w:lvl>
+    <w:lvl w:ilvl="2" w:tentative="1">
+      <w:start w:val="1"/>
+      <w:numFmt w:val="bullet"/>
+      <w:lvlText w:val=""/>
+      <w:lvlJc w:val="left"/>
+      <w:pPr>
+        <w:tabs>
+          <w:tab w:val="num" w:pos="2160"/>
+        </w:tabs>
+        <w:ind w:left="2160" w:hanging="360"/>
+      </w:pPr>
+      <w:rPr>
+        <w:rFonts w:ascii="Wingdings" w:hAnsi="Wingdings" w:hint="default"/>
+        <w:sz w:val="20"/>
+      </w:rPr>
+    </w:lvl>
+    <w:lvl w:ilvl="3" w:tentative="1">
+      <w:start w:val="1"/>
+      <w:numFmt w:val="bullet"/>
+      <w:lvlText w:val=""/>
+      <w:lvlJc w:val="left"/>
+      <w:pPr>
+        <w:tabs>
+          <w:tab w:val="num" w:pos="2880"/>
+        </w:tabs>
+        <w:ind w:left="2880" w:hanging="360"/>
+      </w:pPr>
+      <w:rPr>
+        <w:rFonts w:ascii="Wingdings" w:hAnsi="Wingdings" w:hint="default"/>
+        <w:sz w:val="20"/>
+      </w:rPr>
+    </w:lvl>
+    <w:lvl w:ilvl="4" w:tentative="1">
+      <w:start w:val="1"/>
+      <w:numFmt w:val="bullet"/>
+      <w:lvlText w:val=""/>
+      <w:lvlJc w:val="left"/>
+      <w:pPr>
+        <w:tabs>
+          <w:tab w:val="num" w:pos="3600"/>
+        </w:tabs>
+        <w:ind w:left="3600" w:hanging="360"/>
+      </w:pPr>
+      <w:rPr>
+        <w:rFonts w:ascii="Wingdings" w:hAnsi="Wingdings" w:hint="default"/>
+        <w:sz w:val="20"/>
+      </w:rPr>
+    </w:lvl>
+    <w:lvl w:ilvl="5" w:tentative="1">
+      <w:start w:val="1"/>
+      <w:numFmt w:val="bullet"/>
+      <w:lvlText w:val=""/>
+      <w:lvlJc w:val="left"/>
+      <w:pPr>
+        <w:tabs>
+          <w:tab w:val="num" w:pos="4320"/>
+        </w:tabs>
+        <w:ind w:left="4320" w:hanging="360"/>
+      </w:pPr>
+      <w:rPr>
+        <w:rFonts w:ascii="Wingdings" w:hAnsi="Wingdings" w:hint="default"/>
+        <w:sz w:val="20"/>
+      </w:rPr>
+    </w:lvl>
+    <w:lvl w:ilvl="6" w:tentative="1">
+      <w:start w:val="1"/>
+      <w:numFmt w:val="bullet"/>
+      <w:lvlText w:val=""/>
+      <w:lvlJc w:val="left"/>
+      <w:pPr>
+        <w:tabs>
+          <w:tab w:val="num" w:pos="5040"/>
+        </w:tabs>
+        <w:ind w:left="5040" w:hanging="360"/>
+      </w:pPr>
+      <w:rPr>
+        <w:rFonts w:ascii="Wingdings" w:hAnsi="Wingdings" w:hint="default"/>
+        <w:sz w:val="20"/>
+      </w:rPr>
+    </w:lvl>
+    <w:lvl w:ilvl="7" w:tentative="1">
+      <w:start w:val="1"/>
+      <w:numFmt w:val="bullet"/>
+      <w:lvlText w:val=""/>
+      <w:lvlJc w:val="left"/>
+      <w:pPr>
+        <w:tabs>
+          <w:tab w:val="num" w:pos="5760"/>
+        </w:tabs>
+        <w:ind w:left="5760" w:hanging="360"/>
+      </w:pPr>
+      <w:rPr>
+        <w:rFonts w:ascii="Wingdings" w:hAnsi="Wingdings" w:hint="default"/>
+        <w:sz w:val="20"/>
+      </w:rPr>
+    </w:lvl>
+    <w:lvl w:ilvl="8" w:tentative="1">
+      <w:start w:val="1"/>
+      <w:numFmt w:val="bullet"/>
+      <w:lvlText w:val=""/>
+      <w:lvlJc w:val="left"/>
+      <w:pPr>
+        <w:tabs>
+          <w:tab w:val="num" w:pos="6480"/>
+        </w:tabs>
+        <w:ind w:left="6480" w:hanging="360"/>
+      </w:pPr>
+      <w:rPr>
+        <w:rFonts w:ascii="Wingdings" w:hAnsi="Wingdings" w:hint="default"/>
+        <w:sz w:val="20"/>
+      </w:rPr>
+    </w:lvl>
+  </w:abstractNum>
+  <w:abstractNum w:abstractNumId="7" w15:restartNumberingAfterBreak="0">
+    <w:nsid w:val="7A6846DC"/>
+    <w:multiLevelType w:val="multilevel"/>
+    <w:tmpl w:val="4EB60FD4"/>
     <w:lvl w:ilvl="0">
       <w:start w:val="1"/>
       <w:numFmt w:val="bullet"/>
@@ -5232,16 +5873,25 @@
     </w:lvlOverride>
   </w:num>
   <w:num w:numId="3" w16cid:durableId="1435322536">
-    <w:abstractNumId w:val="2"/>
+    <w:abstractNumId w:val="4"/>
   </w:num>
   <w:num w:numId="4" w16cid:durableId="1235817633">
-    <w:abstractNumId w:val="4"/>
+    <w:abstractNumId w:val="6"/>
   </w:num>
   <w:num w:numId="5" w16cid:durableId="1116826903">
-    <w:abstractNumId w:val="3"/>
+    <w:abstractNumId w:val="5"/>
     <w:lvlOverride w:ilvl="0">
       <w:startOverride w:val="1"/>
     </w:lvlOverride>
+  </w:num>
+  <w:num w:numId="6" w16cid:durableId="1750810644">
+    <w:abstractNumId w:val="2"/>
+  </w:num>
+  <w:num w:numId="7" w16cid:durableId="1307855713">
+    <w:abstractNumId w:val="7"/>
+  </w:num>
+  <w:num w:numId="8" w16cid:durableId="857963808">
+    <w:abstractNumId w:val="3"/>
   </w:num>
 </w:numbering>
 </file>
@@ -5833,6 +6483,48 @@
       <w:szCs w:val="20"/>
     </w:rPr>
   </w:style>
+  <w:style w:type="paragraph" w:styleId="Header">
+    <w:name w:val="header"/>
+    <w:basedOn w:val="Normal"/>
+    <w:link w:val="HeaderChar"/>
+    <w:uiPriority w:val="99"/>
+    <w:unhideWhenUsed/>
+    <w:rsid w:val="007D71FD"/>
+    <w:pPr>
+      <w:tabs>
+        <w:tab w:val="center" w:pos="4680"/>
+        <w:tab w:val="right" w:pos="9360"/>
+      </w:tabs>
+    </w:pPr>
+  </w:style>
+  <w:style w:type="character" w:customStyle="1" w:styleId="HeaderChar">
+    <w:name w:val="Header Char"/>
+    <w:basedOn w:val="DefaultParagraphFont"/>
+    <w:link w:val="Header"/>
+    <w:uiPriority w:val="99"/>
+    <w:rsid w:val="007D71FD"/>
+  </w:style>
+  <w:style w:type="paragraph" w:styleId="Footer">
+    <w:name w:val="footer"/>
+    <w:basedOn w:val="Normal"/>
+    <w:link w:val="FooterChar"/>
+    <w:uiPriority w:val="99"/>
+    <w:unhideWhenUsed/>
+    <w:rsid w:val="007D71FD"/>
+    <w:pPr>
+      <w:tabs>
+        <w:tab w:val="center" w:pos="4680"/>
+        <w:tab w:val="right" w:pos="9360"/>
+      </w:tabs>
+    </w:pPr>
+  </w:style>
+  <w:style w:type="character" w:customStyle="1" w:styleId="FooterChar">
+    <w:name w:val="Footer Char"/>
+    <w:basedOn w:val="DefaultParagraphFont"/>
+    <w:link w:val="Footer"/>
+    <w:uiPriority w:val="99"/>
+    <w:rsid w:val="007D71FD"/>
+  </w:style>
 </w:styles>
 </file>
 

</xml_diff>

<commit_message>
book: create word doc
</commit_message>
<xml_diff>
--- a/docs/proposal-docs/EMIT_Project-Proposal-Form_Updated.docx
+++ b/docs/proposal-docs/EMIT_Project-Proposal-Form_Updated.docx
@@ -158,12 +158,21 @@
             <w:pPr>
               <w:spacing w:after="100"/>
             </w:pPr>
-            <w:r>
-              <w:rPr>
-                <w:b/>
-                <w:bCs/>
-              </w:rPr>
-              <w:t>Student's Roll:</w:t>
+            <w:proofErr w:type="gramStart"/>
+            <w:r>
+              <w:rPr>
+                <w:b/>
+                <w:bCs/>
+              </w:rPr>
+              <w:t>Student's</w:t>
+            </w:r>
+            <w:proofErr w:type="gramEnd"/>
+            <w:r>
+              <w:rPr>
+                <w:b/>
+                <w:bCs/>
+              </w:rPr>
+              <w:t xml:space="preserve"> Roll:</w:t>
             </w:r>
           </w:p>
         </w:tc>
@@ -321,7 +330,15 @@
               <w:spacing w:after="100"/>
             </w:pPr>
             <w:r>
-              <w:t xml:space="preserve">The Govt. Haraganga College Alumni Association needs a low-cost, maintainable and privacy-aware system of record that volunteers can operate. The platform must work without enterprise-level staffing, recurring software </w:t>
+              <w:t xml:space="preserve">The Govt. </w:t>
+            </w:r>
+            <w:proofErr w:type="spellStart"/>
+            <w:r>
+              <w:t>Haraganga</w:t>
+            </w:r>
+            <w:proofErr w:type="spellEnd"/>
+            <w:r>
+              <w:t xml:space="preserve"> College Alumni Association needs a low-cost, maintainable and privacy-aware system of record that volunteers can operate. The platform must work without enterprise-level staffing, recurring software </w:t>
             </w:r>
             <w:r>
               <w:t>licenses</w:t>
@@ -415,7 +432,15 @@
               <w:spacing w:after="100"/>
             </w:pPr>
             <w:r>
-              <w:t>The project was positioned against institutional advancement platforms, CiviCRM and other open-source membership systems, general-purpose CRM products such as Salesforce Nonprofit Success Pack, Zoho CRM and HubSpot, and community products such as Discourse. Those products are stronger in some mature functions, especially campaigns, reporting, directories, events and mentoring. The identified gap is their combination of:</w:t>
+              <w:t xml:space="preserve">The project was positioned against institutional advancement platforms, </w:t>
+            </w:r>
+            <w:proofErr w:type="spellStart"/>
+            <w:r>
+              <w:t>CiviCRM</w:t>
+            </w:r>
+            <w:proofErr w:type="spellEnd"/>
+            <w:r>
+              <w:t xml:space="preserve"> and other open-source membership systems, general-purpose CRM products such as Salesforce Nonprofit Success Pack, Zoho CRM and HubSpot, and community products such as Discourse. Those products are stronger in some mature functions, especially campaigns, reporting, directories, events and mentoring. The identified gap is their combination of:</w:t>
             </w:r>
           </w:p>
           <w:p>
@@ -941,7 +966,15 @@
               <w:spacing w:after="100"/>
             </w:pPr>
             <w:r>
-              <w:t>The project uses backend unit tests for services, validators and business rules; backend integration tests for database and API behavior; EF Core SQLite and in-memory test configurations; Angular unit tests using Vitest; Flutter widget and service tests; Playwright end-to-end tests; authentication, authorization and privacy tests; API contract and compatibility checks; selected visual regression tests; and static analysis, type checking and build verification. Evidence includes backend statement and branch coverage through Coverlet, requirement coverage through the traceability matrix, critical business-rule tests, API and end-to-end results, security assessment, usability findings, performance measurements, maintainability evidence and deployment-cost assessment.</w:t>
+              <w:t xml:space="preserve">The project uses backend unit tests for services, validators and business rules; backend integration tests for database and API behavior; EF Core SQLite and in-memory test configurations; Angular unit tests using </w:t>
+            </w:r>
+            <w:proofErr w:type="spellStart"/>
+            <w:r>
+              <w:t>Vitest</w:t>
+            </w:r>
+            <w:proofErr w:type="spellEnd"/>
+            <w:r>
+              <w:t>; Flutter widget and service tests; Playwright end-to-end tests; authentication, authorization and privacy tests; API contract and compatibility checks; selected visual regression tests; and static analysis, type checking and build verification. Evidence includes backend statement and branch coverage through Coverlet, requirement coverage through the traceability matrix, critical business-rule tests, API and end-to-end results, security assessment, usability findings, performance measurements, maintainability evidence and deployment-cost assessment.</w:t>
             </w:r>
           </w:p>
           <w:p>
@@ -982,15 +1015,21 @@
               <w:spacing w:after="100"/>
             </w:pPr>
             <w:r>
-              <w:t>Requirements are handled as an engineering activity with its own outputs, not as notes kept before coding. They are elicited from four sources: stakeholder interviews, the Association's current manual process, its constitution and election documents, and software-engineering standards. They are specified to ISO/IEC/IEEE 29148 in the "shall" form, each with an identifier, source and priority. Quality requirements are classified by ISO/IEC 25010 and restated as testable quality-attribute scenarios. Constitutional rules become domain constraints that the software must not break, and stakeholders cannot negotiate them away. Requirements are prioritised with MoSCoW and validated by formal technical review.</w:t>
-            </w:r>
-          </w:p>
-          <w:p>
-            <w:pPr>
-              <w:spacing w:after="100"/>
-            </w:pPr>
-            <w:r>
-              <w:t>Specification-driven development is carried out with GitHub Spec Kit. A short specification constitution sets five rules every spec must follow: keep the existing product contract, trace shared behaviour across the API, web and mobile clients, keep layer boundaries clear, treat security and privacy as requirements, and back every claim with a repository check. The work proceeds in Spec Kit's order: specify, clarify, plan, break into tasks, implement. Each domain spec holds user stories with acceptance scenarios, functional requirements, success criteria, an evidence table linking each requirement to its controller, service, screens and test, and a gaps list for requirements that have no test yet.</w:t>
+              <w:t xml:space="preserve">Requirements are handled as an engineering activity with its own outputs, not as notes kept before coding. They are elicited from four sources: stakeholder interviews, the Association's current manual process, its constitution and election documents, and software-engineering standards. They are specified to ISO/IEC/IEEE 29148 in the "shall" form, each with an identifier, source and priority. Quality requirements are classified by ISO/IEC 25010 and restated as testable quality-attribute scenarios. Constitutional rules become domain constraints that the software must not break, and stakeholders cannot negotiate them away. </w:t>
+            </w:r>
+          </w:p>
+          <w:p>
+            <w:pPr>
+              <w:spacing w:after="100"/>
+            </w:pPr>
+            <w:r>
+              <w:t xml:space="preserve">Specification-driven development is carried out with GitHub Spec Kit. A short specification constitution sets five rules every spec must follow: keep the existing product contract, trace shared </w:t>
+            </w:r>
+            <w:r>
+              <w:t>behavior</w:t>
+            </w:r>
+            <w:r>
+              <w:t xml:space="preserve"> across the API, web and mobile clients, keep layer boundaries clear, treat security and privacy as requirements, and back every claim with a repository check. The work proceeds in Spec Kit's order: specify, clarify, plan, break into tasks, implement. Each domain spec holds user stories with acceptance scenarios, functional requirements, success criteria, an evidence table linking each requirement to its controller, service, screens and test, and a gaps list for requirements that have no test yet.</w:t>
             </w:r>
           </w:p>
           <w:p>
@@ -4175,7 +4214,23 @@
                 <w:b/>
                 <w:bCs/>
               </w:rPr>
-              <w:t>AI Tools / Assistants (if any) — e.g., GitHub Copilot, ChatGPT, Claude</w:t>
+              <w:t xml:space="preserve">AI Tools / Assistants (if </w:t>
+            </w:r>
+            <w:proofErr w:type="gramStart"/>
+            <w:r>
+              <w:rPr>
+                <w:b/>
+                <w:bCs/>
+              </w:rPr>
+              <w:t>any) —</w:t>
+            </w:r>
+            <w:proofErr w:type="gramEnd"/>
+            <w:r>
+              <w:rPr>
+                <w:b/>
+                <w:bCs/>
+              </w:rPr>
+              <w:t xml:space="preserve"> e.g., GitHub Copilot, ChatGPT, Claude</w:t>
             </w:r>
             <w:r>
               <w:t>: GitHub Copilot (via Copilot SDK in VS Code), Claude</w:t>
@@ -4238,7 +4293,15 @@
               <w:t>Authentication</w:t>
             </w:r>
             <w:r>
-              <w:t>: JWT, BCrypt and role-based authorization</w:t>
+              <w:t xml:space="preserve">: JWT, </w:t>
+            </w:r>
+            <w:proofErr w:type="spellStart"/>
+            <w:r>
+              <w:t>BCrypt</w:t>
+            </w:r>
+            <w:proofErr w:type="spellEnd"/>
+            <w:r>
+              <w:t xml:space="preserve"> and role-based authorization</w:t>
             </w:r>
           </w:p>
           <w:p>
@@ -4258,7 +4321,39 @@
               <w:t>Testing</w:t>
             </w:r>
             <w:r>
-              <w:t>: NUnit, Moq, FluentAssertions, Vitest, Playwright, Flutter Test and integration tests</w:t>
+              <w:t xml:space="preserve">: </w:t>
+            </w:r>
+            <w:proofErr w:type="spellStart"/>
+            <w:r>
+              <w:t>NUnit</w:t>
+            </w:r>
+            <w:proofErr w:type="spellEnd"/>
+            <w:r>
+              <w:t xml:space="preserve">, </w:t>
+            </w:r>
+            <w:proofErr w:type="spellStart"/>
+            <w:r>
+              <w:t>Moq</w:t>
+            </w:r>
+            <w:proofErr w:type="spellEnd"/>
+            <w:r>
+              <w:t xml:space="preserve">, </w:t>
+            </w:r>
+            <w:proofErr w:type="spellStart"/>
+            <w:r>
+              <w:t>FluentAssertions</w:t>
+            </w:r>
+            <w:proofErr w:type="spellEnd"/>
+            <w:r>
+              <w:t xml:space="preserve">, </w:t>
+            </w:r>
+            <w:proofErr w:type="spellStart"/>
+            <w:r>
+              <w:t>Vitest</w:t>
+            </w:r>
+            <w:proofErr w:type="spellEnd"/>
+            <w:r>
+              <w:t>, Playwright, Flutter Test and integration tests</w:t>
             </w:r>
           </w:p>
           <w:p>

</xml_diff>